<commit_message>
Remove retired project language from full workspace
</commit_message>
<xml_diff>
--- a/output/docx/VCC_Board_Action_Packet_DRAFT.docx
+++ b/output/docx/VCC_Board_Action_Packet_DRAFT.docx
@@ -421,6 +421,11 @@
         </w:tc>
       </w:tr>
     </w:tbl>
+    <w:p>
+      <w:r>
+        <w:br w:type="page"/>
+      </w:r>
+    </w:p>
     <w:p>
       <w:pPr>
         <w:pStyle w:val="Heading1"/>
@@ -1250,6 +1255,11 @@
       </w:tr>
     </w:tbl>
     <w:p>
+      <w:r>
+        <w:br w:type="page"/>
+      </w:r>
+    </w:p>
+    <w:p>
       <w:pPr>
         <w:pStyle w:val="Heading1"/>
         <w:spacing w:before="360" w:after="200"/>
@@ -1430,6 +1440,11 @@
           <w:color w:val="1F2937"/>
         </w:rPr>
         <w:t>The corporation authorizes drafting of outreach, MOU, sponsorship, and grant materials. No contract, MOU, sponsorship, grant submission, or financial obligation is effective without approval and signature.</w:t>
+      </w:r>
+    </w:p>
+    <w:p>
+      <w:r>
+        <w:br w:type="page"/>
       </w:r>
     </w:p>
     <w:p>

</xml_diff>

<commit_message>
Complete VCC launch controls and RV diligence
</commit_message>
<xml_diff>
--- a/output/docx/VCC_Board_Action_Packet_DRAFT.docx
+++ b/output/docx/VCC_Board_Action_Packet_DRAFT.docx
@@ -278,7 +278,7 @@
                 <w:color w:val="1F2937"/>
                 <w:sz w:val="18"/>
               </w:rPr>
-              <w:t>Trust/SF language</w:t>
+              <w:t>Unverified ownership language</w:t>
             </w:r>
           </w:p>
         </w:tc>
@@ -305,7 +305,7 @@
                 <w:color w:val="1F2937"/>
                 <w:sz w:val="18"/>
               </w:rPr>
-              <w:t>Do not use externally unless separately approved for a limited purpose.</w:t>
+              <w:t>Do not use externally unless counsel/CPA approves a limited internal purpose.</w:t>
             </w:r>
           </w:p>
         </w:tc>

</xml_diff>